<commit_message>
Stop Pandoc adding a second set of section numbers
Every section already carries its number in the heading text, and the
cross-references in the body point at those numbers. Passing
--number-sections made Pandoc add its own numbering on top instead of
replacing it, so headings rendered with two numbers: "2.1 1.1 Background
and Motivation". Pandoc's count was also offset by one, because it treats
the front matter as the first chapter, so the two numbers disagreed.

Dropped the flag from the render commands and from Appendix C, with a
note explaining why it must not be added back. Also added -f
markdown-smart to the LaTeX variant, which had been missing it.

Rebuilt: 98 pages, 0 double-numbered headings.
</commit_message>
<xml_diff>
--- a/thesis/CiteGraph-NLP-Thesis.docx
+++ b/thesis/CiteGraph-NLP-Thesis.docx
@@ -35144,347 +35144,376 @@
         <w:rPr>
           <w:rStyle w:val="NormalTok"/>
         </w:rPr>
+        <w:t xml:space="preserve">3</w:t>
+      </w:r>
+    </w:p>
+    <w:p>
+      <w:pPr>
+        <w:pStyle w:val="FirstParagraph"/>
+      </w:pPr>
+      <w:r>
+        <w:t xml:space="preserve">Do not add</w:t>
+      </w:r>
+      <w:r>
+        <w:t xml:space="preserve"> </w:t>
+      </w:r>
+      <w:r>
+        <w:rPr>
+          <w:rStyle w:val="VerbatimChar"/>
+        </w:rPr>
+        <w:t xml:space="preserve">--number-sections</w:t>
+      </w:r>
+      <w:r>
+        <w:t xml:space="preserve">. Every section in this thesis already carries</w:t>
+      </w:r>
+      <w:r>
+        <w:t xml:space="preserve"> </w:t>
+      </w:r>
+      <w:r>
+        <w:t xml:space="preserve">its number in the heading text, and the cross-references throughout the body</w:t>
+      </w:r>
+      <w:r>
+        <w:t xml:space="preserve"> </w:t>
+      </w:r>
+      <w:r>
+        <w:t xml:space="preserve">point at those numbers. Pandoc's automatic numbering is added on top rather</w:t>
+      </w:r>
+      <w:r>
+        <w:t xml:space="preserve"> </w:t>
+      </w:r>
+      <w:r>
+        <w:t xml:space="preserve">than replacing them, so headings render with two numbers ("2.1 1.1 Background</w:t>
+      </w:r>
+      <w:r>
+        <w:t xml:space="preserve"> </w:t>
+      </w:r>
+      <w:r>
+        <w:t xml:space="preserve">and Motivation"), and its count is offset by one because it treats the front</w:t>
+      </w:r>
+      <w:r>
+        <w:t xml:space="preserve"> </w:t>
+      </w:r>
+      <w:r>
+        <w:t xml:space="preserve">matter as the first chapter.</w:t>
+      </w:r>
+    </w:p>
+    <w:p>
+      <w:pPr>
+        <w:pStyle w:val="BodyText"/>
+      </w:pPr>
+      <w:r>
+        <w:rPr>
+          <w:rStyle w:val="VerbatimChar"/>
+        </w:rPr>
+        <w:t xml:space="preserve">-f markdown-smart</w:t>
+      </w:r>
+      <w:r>
+        <w:t xml:space="preserve"> </w:t>
+      </w:r>
+      <w:r>
+        <w:t xml:space="preserve">matters. Pandoc's smart typography rewrites</w:t>
+      </w:r>
+      <w:r>
+        <w:t xml:space="preserve"> </w:t>
+      </w:r>
+      <w:r>
+        <w:rPr>
+          <w:rStyle w:val="VerbatimChar"/>
+        </w:rPr>
+        <w:t xml:space="preserve">--</w:t>
+      </w:r>
+      <w:r>
+        <w:t xml:space="preserve"> </w:t>
+      </w:r>
+      <w:r>
+        <w:t xml:space="preserve">as an en</w:t>
+      </w:r>
+      <w:r>
+        <w:t xml:space="preserve"> </w:t>
+      </w:r>
+      <w:r>
+        <w:t xml:space="preserve">dash and</w:t>
+      </w:r>
+      <w:r>
+        <w:t xml:space="preserve"> </w:t>
+      </w:r>
+      <w:r>
+        <w:rPr>
+          <w:rStyle w:val="VerbatimChar"/>
+        </w:rPr>
+        <w:t xml:space="preserve">---</w:t>
+      </w:r>
+      <w:r>
+        <w:t xml:space="preserve"> </w:t>
+      </w:r>
+      <w:r>
+        <w:t xml:space="preserve">as an em dash, so the rendered PDF ends up containing dashes the</w:t>
+      </w:r>
+      <w:r>
+        <w:t xml:space="preserve"> </w:t>
+      </w:r>
+      <w:r>
+        <w:t xml:space="preserve">source never had. A mechanical pre-submission check run against that PDF then</w:t>
+      </w:r>
+      <w:r>
+        <w:t xml:space="preserve"> </w:t>
+      </w:r>
+      <w:r>
+        <w:t xml:space="preserve">reports them as prose findings: five of the six em dashes flagged in one such</w:t>
+      </w:r>
+      <w:r>
+        <w:t xml:space="preserve"> </w:t>
+      </w:r>
+      <w:r>
+        <w:t xml:space="preserve">run came from this conversion rather than from the manuscript.</w:t>
+      </w:r>
+    </w:p>
+    <w:p>
+      <w:pPr>
+        <w:pStyle w:val="BodyText"/>
+      </w:pPr>
+      <w:r>
+        <w:t xml:space="preserve">A DOCX, if the department requires one:</w:t>
+      </w:r>
+    </w:p>
+    <w:p>
+      <w:pPr>
+        <w:pStyle w:val="SourceCode"/>
+      </w:pPr>
+      <w:r>
+        <w:rPr>
+          <w:rStyle w:val="ExtensionTok"/>
+        </w:rPr>
+        <w:t xml:space="preserve">pandoc</w:t>
+      </w:r>
+      <w:r>
+        <w:rPr>
+          <w:rStyle w:val="NormalTok"/>
+        </w:rPr>
+        <w:t xml:space="preserve"> thesis/CiteGraph-NLP-Thesis.md </w:t>
+      </w:r>
+      <w:r>
+        <w:rPr>
+          <w:rStyle w:val="DataTypeTok"/>
+        </w:rPr>
+        <w:t xml:space="preserve">\</w:t>
+      </w:r>
+      <w:r>
+        <w:br/>
+      </w:r>
+      <w:r>
+        <w:rPr>
+          <w:rStyle w:val="NormalTok"/>
+        </w:rPr>
+        <w:t xml:space="preserve">  </w:t>
+      </w:r>
+      <w:r>
+        <w:rPr>
+          <w:rStyle w:val="AttributeTok"/>
+        </w:rPr>
+        <w:t xml:space="preserve">-o</w:t>
+      </w:r>
+      <w:r>
+        <w:rPr>
+          <w:rStyle w:val="NormalTok"/>
+        </w:rPr>
+        <w:t xml:space="preserve"> thesis/CiteGraph-NLP-Thesis.docx </w:t>
+      </w:r>
+      <w:r>
+        <w:rPr>
+          <w:rStyle w:val="DataTypeTok"/>
+        </w:rPr>
+        <w:t xml:space="preserve">\</w:t>
+      </w:r>
+      <w:r>
+        <w:br/>
+      </w:r>
+      <w:r>
+        <w:rPr>
+          <w:rStyle w:val="NormalTok"/>
+        </w:rPr>
+        <w:t xml:space="preserve">  </w:t>
+      </w:r>
+      <w:r>
+        <w:rPr>
+          <w:rStyle w:val="AttributeTok"/>
+        </w:rPr>
+        <w:t xml:space="preserve">-f</w:t>
+      </w:r>
+      <w:r>
+        <w:rPr>
+          <w:rStyle w:val="NormalTok"/>
+        </w:rPr>
+        <w:t xml:space="preserve"> markdown-smart </w:t>
+      </w:r>
+      <w:r>
+        <w:rPr>
+          <w:rStyle w:val="DataTypeTok"/>
+        </w:rPr>
+        <w:t xml:space="preserve">\</w:t>
+      </w:r>
+      <w:r>
+        <w:br/>
+      </w:r>
+      <w:r>
+        <w:rPr>
+          <w:rStyle w:val="NormalTok"/>
+        </w:rPr>
+        <w:t xml:space="preserve">  </w:t>
+      </w:r>
+      <w:r>
+        <w:rPr>
+          <w:rStyle w:val="AttributeTok"/>
+        </w:rPr>
+        <w:t xml:space="preserve">--toc</w:t>
+      </w:r>
+      <w:r>
+        <w:rPr>
+          <w:rStyle w:val="NormalTok"/>
+        </w:rPr>
+        <w:t xml:space="preserve"> </w:t>
+      </w:r>
+      <w:r>
+        <w:rPr>
+          <w:rStyle w:val="AttributeTok"/>
+        </w:rPr>
+        <w:t xml:space="preserve">--toc-depth</w:t>
+      </w:r>
+      <w:r>
+        <w:rPr>
+          <w:rStyle w:val="OperatorTok"/>
+        </w:rPr>
+        <w:t xml:space="preserve">=</w:t>
+      </w:r>
+      <w:r>
+        <w:rPr>
+          <w:rStyle w:val="NormalTok"/>
+        </w:rPr>
+        <w:t xml:space="preserve">3</w:t>
+      </w:r>
+    </w:p>
+    <w:p>
+      <w:pPr>
+        <w:pStyle w:val="FirstParagraph"/>
+      </w:pPr>
+      <w:r>
+        <w:t xml:space="preserve">With a LaTeX distribution instead:</w:t>
+      </w:r>
+    </w:p>
+    <w:p>
+      <w:pPr>
+        <w:pStyle w:val="SourceCode"/>
+      </w:pPr>
+      <w:r>
+        <w:rPr>
+          <w:rStyle w:val="ExtensionTok"/>
+        </w:rPr>
+        <w:t xml:space="preserve">pandoc</w:t>
+      </w:r>
+      <w:r>
+        <w:rPr>
+          <w:rStyle w:val="NormalTok"/>
+        </w:rPr>
+        <w:t xml:space="preserve"> thesis/CiteGraph-NLP-Thesis.md </w:t>
+      </w:r>
+      <w:r>
+        <w:rPr>
+          <w:rStyle w:val="DataTypeTok"/>
+        </w:rPr>
+        <w:t xml:space="preserve">\</w:t>
+      </w:r>
+      <w:r>
+        <w:br/>
+      </w:r>
+      <w:r>
+        <w:rPr>
+          <w:rStyle w:val="NormalTok"/>
+        </w:rPr>
+        <w:t xml:space="preserve">  </w:t>
+      </w:r>
+      <w:r>
+        <w:rPr>
+          <w:rStyle w:val="AttributeTok"/>
+        </w:rPr>
+        <w:t xml:space="preserve">-o</w:t>
+      </w:r>
+      <w:r>
+        <w:rPr>
+          <w:rStyle w:val="NormalTok"/>
+        </w:rPr>
+        <w:t xml:space="preserve"> thesis/CiteGraph-NLP-Thesis.pdf </w:t>
+      </w:r>
+      <w:r>
+        <w:rPr>
+          <w:rStyle w:val="DataTypeTok"/>
+        </w:rPr>
+        <w:t xml:space="preserve">\</w:t>
+      </w:r>
+      <w:r>
+        <w:br/>
+      </w:r>
+      <w:r>
+        <w:rPr>
+          <w:rStyle w:val="NormalTok"/>
+        </w:rPr>
+        <w:t xml:space="preserve">  </w:t>
+      </w:r>
+      <w:r>
+        <w:rPr>
+          <w:rStyle w:val="AttributeTok"/>
+        </w:rPr>
+        <w:t xml:space="preserve">-f</w:t>
+      </w:r>
+      <w:r>
+        <w:rPr>
+          <w:rStyle w:val="NormalTok"/>
+        </w:rPr>
+        <w:t xml:space="preserve"> markdown-smart </w:t>
+      </w:r>
+      <w:r>
+        <w:rPr>
+          <w:rStyle w:val="DataTypeTok"/>
+        </w:rPr>
+        <w:t xml:space="preserve">\</w:t>
+      </w:r>
+      <w:r>
+        <w:br/>
+      </w:r>
+      <w:r>
+        <w:rPr>
+          <w:rStyle w:val="NormalTok"/>
+        </w:rPr>
+        <w:t xml:space="preserve">  </w:t>
+      </w:r>
+      <w:r>
+        <w:rPr>
+          <w:rStyle w:val="AttributeTok"/>
+        </w:rPr>
+        <w:t xml:space="preserve">--toc</w:t>
+      </w:r>
+      <w:r>
+        <w:rPr>
+          <w:rStyle w:val="NormalTok"/>
+        </w:rPr>
+        <w:t xml:space="preserve"> </w:t>
+      </w:r>
+      <w:r>
+        <w:rPr>
+          <w:rStyle w:val="AttributeTok"/>
+        </w:rPr>
+        <w:t xml:space="preserve">--toc-depth</w:t>
+      </w:r>
+      <w:r>
+        <w:rPr>
+          <w:rStyle w:val="OperatorTok"/>
+        </w:rPr>
+        <w:t xml:space="preserve">=</w:t>
+      </w:r>
+      <w:r>
+        <w:rPr>
+          <w:rStyle w:val="NormalTok"/>
+        </w:rPr>
         <w:t xml:space="preserve">3 </w:t>
-      </w:r>
-      <w:r>
-        <w:rPr>
-          <w:rStyle w:val="DataTypeTok"/>
-        </w:rPr>
-        <w:t xml:space="preserve">\</w:t>
-      </w:r>
-      <w:r>
-        <w:br/>
-      </w:r>
-      <w:r>
-        <w:rPr>
-          <w:rStyle w:val="NormalTok"/>
-        </w:rPr>
-        <w:t xml:space="preserve">  </w:t>
-      </w:r>
-      <w:r>
-        <w:rPr>
-          <w:rStyle w:val="AttributeTok"/>
-        </w:rPr>
-        <w:t xml:space="preserve">--number-sections</w:t>
-      </w:r>
-    </w:p>
-    <w:p>
-      <w:pPr>
-        <w:pStyle w:val="FirstParagraph"/>
-      </w:pPr>
-      <w:r>
-        <w:rPr>
-          <w:rStyle w:val="VerbatimChar"/>
-        </w:rPr>
-        <w:t xml:space="preserve">-f markdown-smart</w:t>
-      </w:r>
-      <w:r>
-        <w:t xml:space="preserve"> </w:t>
-      </w:r>
-      <w:r>
-        <w:t xml:space="preserve">matters. Pandoc's smart typography rewrites</w:t>
-      </w:r>
-      <w:r>
-        <w:t xml:space="preserve"> </w:t>
-      </w:r>
-      <w:r>
-        <w:rPr>
-          <w:rStyle w:val="VerbatimChar"/>
-        </w:rPr>
-        <w:t xml:space="preserve">--</w:t>
-      </w:r>
-      <w:r>
-        <w:t xml:space="preserve"> </w:t>
-      </w:r>
-      <w:r>
-        <w:t xml:space="preserve">as an en</w:t>
-      </w:r>
-      <w:r>
-        <w:t xml:space="preserve"> </w:t>
-      </w:r>
-      <w:r>
-        <w:t xml:space="preserve">dash and</w:t>
-      </w:r>
-      <w:r>
-        <w:t xml:space="preserve"> </w:t>
-      </w:r>
-      <w:r>
-        <w:rPr>
-          <w:rStyle w:val="VerbatimChar"/>
-        </w:rPr>
-        <w:t xml:space="preserve">---</w:t>
-      </w:r>
-      <w:r>
-        <w:t xml:space="preserve"> </w:t>
-      </w:r>
-      <w:r>
-        <w:t xml:space="preserve">as an em dash, so the rendered PDF ends up containing dashes the</w:t>
-      </w:r>
-      <w:r>
-        <w:t xml:space="preserve"> </w:t>
-      </w:r>
-      <w:r>
-        <w:t xml:space="preserve">source never had. A mechanical pre-submission check run against that PDF then</w:t>
-      </w:r>
-      <w:r>
-        <w:t xml:space="preserve"> </w:t>
-      </w:r>
-      <w:r>
-        <w:t xml:space="preserve">reports them as prose findings: five of the six em dashes flagged in one such</w:t>
-      </w:r>
-      <w:r>
-        <w:t xml:space="preserve"> </w:t>
-      </w:r>
-      <w:r>
-        <w:t xml:space="preserve">run came from this conversion rather than from the manuscript.</w:t>
-      </w:r>
-    </w:p>
-    <w:p>
-      <w:pPr>
-        <w:pStyle w:val="BodyText"/>
-      </w:pPr>
-      <w:r>
-        <w:t xml:space="preserve">A DOCX, if the department requires one:</w:t>
-      </w:r>
-    </w:p>
-    <w:p>
-      <w:pPr>
-        <w:pStyle w:val="SourceCode"/>
-      </w:pPr>
-      <w:r>
-        <w:rPr>
-          <w:rStyle w:val="ExtensionTok"/>
-        </w:rPr>
-        <w:t xml:space="preserve">pandoc</w:t>
-      </w:r>
-      <w:r>
-        <w:rPr>
-          <w:rStyle w:val="NormalTok"/>
-        </w:rPr>
-        <w:t xml:space="preserve"> thesis/CiteGraph-NLP-Thesis.md </w:t>
-      </w:r>
-      <w:r>
-        <w:rPr>
-          <w:rStyle w:val="DataTypeTok"/>
-        </w:rPr>
-        <w:t xml:space="preserve">\</w:t>
-      </w:r>
-      <w:r>
-        <w:br/>
-      </w:r>
-      <w:r>
-        <w:rPr>
-          <w:rStyle w:val="NormalTok"/>
-        </w:rPr>
-        <w:t xml:space="preserve">  </w:t>
-      </w:r>
-      <w:r>
-        <w:rPr>
-          <w:rStyle w:val="AttributeTok"/>
-        </w:rPr>
-        <w:t xml:space="preserve">-o</w:t>
-      </w:r>
-      <w:r>
-        <w:rPr>
-          <w:rStyle w:val="NormalTok"/>
-        </w:rPr>
-        <w:t xml:space="preserve"> thesis/CiteGraph-NLP-Thesis.docx </w:t>
-      </w:r>
-      <w:r>
-        <w:rPr>
-          <w:rStyle w:val="DataTypeTok"/>
-        </w:rPr>
-        <w:t xml:space="preserve">\</w:t>
-      </w:r>
-      <w:r>
-        <w:br/>
-      </w:r>
-      <w:r>
-        <w:rPr>
-          <w:rStyle w:val="NormalTok"/>
-        </w:rPr>
-        <w:t xml:space="preserve">  </w:t>
-      </w:r>
-      <w:r>
-        <w:rPr>
-          <w:rStyle w:val="AttributeTok"/>
-        </w:rPr>
-        <w:t xml:space="preserve">-f</w:t>
-      </w:r>
-      <w:r>
-        <w:rPr>
-          <w:rStyle w:val="NormalTok"/>
-        </w:rPr>
-        <w:t xml:space="preserve"> markdown-smart </w:t>
-      </w:r>
-      <w:r>
-        <w:rPr>
-          <w:rStyle w:val="DataTypeTok"/>
-        </w:rPr>
-        <w:t xml:space="preserve">\</w:t>
-      </w:r>
-      <w:r>
-        <w:br/>
-      </w:r>
-      <w:r>
-        <w:rPr>
-          <w:rStyle w:val="NormalTok"/>
-        </w:rPr>
-        <w:t xml:space="preserve">  </w:t>
-      </w:r>
-      <w:r>
-        <w:rPr>
-          <w:rStyle w:val="AttributeTok"/>
-        </w:rPr>
-        <w:t xml:space="preserve">--toc</w:t>
-      </w:r>
-      <w:r>
-        <w:rPr>
-          <w:rStyle w:val="NormalTok"/>
-        </w:rPr>
-        <w:t xml:space="preserve"> </w:t>
-      </w:r>
-      <w:r>
-        <w:rPr>
-          <w:rStyle w:val="AttributeTok"/>
-        </w:rPr>
-        <w:t xml:space="preserve">--toc-depth</w:t>
-      </w:r>
-      <w:r>
-        <w:rPr>
-          <w:rStyle w:val="OperatorTok"/>
-        </w:rPr>
-        <w:t xml:space="preserve">=</w:t>
-      </w:r>
-      <w:r>
-        <w:rPr>
-          <w:rStyle w:val="NormalTok"/>
-        </w:rPr>
-        <w:t xml:space="preserve">3</w:t>
-      </w:r>
-    </w:p>
-    <w:p>
-      <w:pPr>
-        <w:pStyle w:val="FirstParagraph"/>
-      </w:pPr>
-      <w:r>
-        <w:t xml:space="preserve">With a LaTeX distribution instead:</w:t>
-      </w:r>
-    </w:p>
-    <w:p>
-      <w:pPr>
-        <w:pStyle w:val="SourceCode"/>
-      </w:pPr>
-      <w:r>
-        <w:rPr>
-          <w:rStyle w:val="ExtensionTok"/>
-        </w:rPr>
-        <w:t xml:space="preserve">pandoc</w:t>
-      </w:r>
-      <w:r>
-        <w:rPr>
-          <w:rStyle w:val="NormalTok"/>
-        </w:rPr>
-        <w:t xml:space="preserve"> thesis/CiteGraph-NLP-Thesis.md </w:t>
-      </w:r>
-      <w:r>
-        <w:rPr>
-          <w:rStyle w:val="DataTypeTok"/>
-        </w:rPr>
-        <w:t xml:space="preserve">\</w:t>
-      </w:r>
-      <w:r>
-        <w:br/>
-      </w:r>
-      <w:r>
-        <w:rPr>
-          <w:rStyle w:val="NormalTok"/>
-        </w:rPr>
-        <w:t xml:space="preserve">  </w:t>
-      </w:r>
-      <w:r>
-        <w:rPr>
-          <w:rStyle w:val="AttributeTok"/>
-        </w:rPr>
-        <w:t xml:space="preserve">-o</w:t>
-      </w:r>
-      <w:r>
-        <w:rPr>
-          <w:rStyle w:val="NormalTok"/>
-        </w:rPr>
-        <w:t xml:space="preserve"> thesis/CiteGraph-NLP-Thesis.pdf </w:t>
-      </w:r>
-      <w:r>
-        <w:rPr>
-          <w:rStyle w:val="DataTypeTok"/>
-        </w:rPr>
-        <w:t xml:space="preserve">\</w:t>
-      </w:r>
-      <w:r>
-        <w:br/>
-      </w:r>
-      <w:r>
-        <w:rPr>
-          <w:rStyle w:val="NormalTok"/>
-        </w:rPr>
-        <w:t xml:space="preserve">  </w:t>
-      </w:r>
-      <w:r>
-        <w:rPr>
-          <w:rStyle w:val="AttributeTok"/>
-        </w:rPr>
-        <w:t xml:space="preserve">--toc</w:t>
-      </w:r>
-      <w:r>
-        <w:rPr>
-          <w:rStyle w:val="NormalTok"/>
-        </w:rPr>
-        <w:t xml:space="preserve"> </w:t>
-      </w:r>
-      <w:r>
-        <w:rPr>
-          <w:rStyle w:val="AttributeTok"/>
-        </w:rPr>
-        <w:t xml:space="preserve">--toc-depth</w:t>
-      </w:r>
-      <w:r>
-        <w:rPr>
-          <w:rStyle w:val="OperatorTok"/>
-        </w:rPr>
-        <w:t xml:space="preserve">=</w:t>
-      </w:r>
-      <w:r>
-        <w:rPr>
-          <w:rStyle w:val="NormalTok"/>
-        </w:rPr>
-        <w:t xml:space="preserve">3 </w:t>
-      </w:r>
-      <w:r>
-        <w:rPr>
-          <w:rStyle w:val="DataTypeTok"/>
-        </w:rPr>
-        <w:t xml:space="preserve">\</w:t>
-      </w:r>
-      <w:r>
-        <w:br/>
-      </w:r>
-      <w:r>
-        <w:rPr>
-          <w:rStyle w:val="NormalTok"/>
-        </w:rPr>
-        <w:t xml:space="preserve">  </w:t>
-      </w:r>
-      <w:r>
-        <w:rPr>
-          <w:rStyle w:val="AttributeTok"/>
-        </w:rPr>
-        <w:t xml:space="preserve">--number-sections</w:t>
-      </w:r>
-      <w:r>
-        <w:rPr>
-          <w:rStyle w:val="NormalTok"/>
-        </w:rPr>
-        <w:t xml:space="preserve"> </w:t>
       </w:r>
       <w:r>
         <w:rPr>

</xml_diff>